<commit_message>
Editie 6: aflevering 9 titel-correctie (Wie verzet zich, wie helpt mee?) + heatmap behouden
</commit_message>
<xml_diff>
--- a/assets/downloads-editie-6/editie6_aflevering-09-pareto-per-actor.docx
+++ b/assets/downloads-editie-6/editie6_aflevering-09-pareto-per-actor.docx
@@ -2,13 +2,13 @@
 <file path=word/document.xml><?xml version="1.0" encoding="utf-8"?>
 <w:document xmlns:w="http://schemas.openxmlformats.org/wordprocessingml/2006/main" xmlns:m="http://schemas.openxmlformats.org/officeDocument/2006/math" xmlns:r="http://schemas.openxmlformats.org/officeDocument/2006/relationships" xmlns:o="urn:schemas-microsoft-com:office:office" xmlns:v="urn:schemas-microsoft-com:vml" xmlns:w10="urn:schemas-microsoft-com:office:word" xmlns:a="http://schemas.openxmlformats.org/drawingml/2006/main" xmlns:pic="http://schemas.openxmlformats.org/drawingml/2006/picture" xmlns:wp="http://schemas.openxmlformats.org/drawingml/2006/wordprocessingDrawing">
   <w:body>
-    <w:bookmarkStart w:id="20" w:name="nova-democratia-pareto-per-actor"/>
+    <w:bookmarkStart w:id="20" w:name="wie-verzet-zich-wie-helpt-mee"/>
     <w:p>
       <w:pPr>
         <w:pStyle w:val="Heading2"/>
       </w:pPr>
       <w:r>
-        <w:t xml:space="preserve">09 — NOVA DEMOCRATIA · PARETO PER ACTOR</w:t>
+        <w:t xml:space="preserve">09 — Wie verzet zich, wie helpt mee?</w:t>
       </w:r>
     </w:p>
     <w:p>
@@ -28,18 +28,6 @@
         <w:pStyle w:val="BodyText"/>
       </w:pPr>
       <w:r>
-        <w:rPr>
-          <w:b/>
-          <w:bCs/>
-        </w:rPr>
-        <w:t xml:space="preserve">Tegenstanders, bondgenoten, en de werkelijke krachtsverhouding</w:t>
-      </w:r>
-    </w:p>
-    <w:p>
-      <w:pPr>
-        <w:pStyle w:val="BodyText"/>
-      </w:pPr>
-      <w:r>
         <w:t xml:space="preserve">De Pareto‐analyse uit aflevering drie behandelde tegenstand als een lijst van losse blokken: Brussel, bonden, partijen, ambtelijke top. Bruikbaar voor strategie, maar onvolledig. Wat ontbrak, was een tweede kolom: bondgenoten. Wie helpt mee — en bij welke fase? Pas wanneer beide kolommen naast elkaar staan, ontstaat het werkelijke krachtenveld.</w:t>
       </w:r>
     </w:p>
@@ -49,18 +37,6 @@
       </w:pPr>
       <w:r>
         <w:t xml:space="preserve">Deze aflevering plot zesentwintig actoren op zes Nova‐Democratia‐fases. Vijftien Tweede Kamerfracties, zes vakbonden en koepels, en vijf bedrijvenkoepels — inclusief het in deze krant voorgestelde UEI, de Europese tegenmacht uit Zwitserland. Iedere cel krijgt een score van min tien tot plus tien. Rood is verzet. Groen is steun. De balk rechts geeft het totaalsaldo: hoe een actor zich over alle fases verhoudt tot Nova Democratia.</w:t>
-      </w:r>
-    </w:p>
-    <w:p>
-      <w:pPr>
-        <w:pStyle w:val="BodyText"/>
-      </w:pPr>
-      <w:r>
-        <w:rPr>
-          <w:b/>
-          <w:bCs/>
-        </w:rPr>
-        <w:t xml:space="preserve">De heatmap</w:t>
       </w:r>
     </w:p>
     <w:p>
@@ -92,15 +68,15 @@
         <w:pStyle w:val="BodyText"/>
       </w:pPr>
       <w:r>
-        <w:t xml:space="preserve">Vijftien fracties, vijftien totalen tussen plus twintig en plus tweeenveertig. Er is geen Tweede Kamerfractie die Nova Democratia per saldo steunt. Dat klinkt dramatisch maar is logisch: alle fracties opereren binnen het bestaande bestel en hebben er bestaansrecht in. De zwaarste tegenstanders zijn GroenLinks‐PvdA (plus tweeënveertig), SP (plus achtendertig) en de VVD (plus zevenendertig). Het lichtst is BBB met plus eenentwintig, dichtgevolgd door NSC en D66‐delen.</w:t>
-      </w:r>
-    </w:p>
-    <w:p>
-      <w:pPr>
-        <w:pStyle w:val="BodyText"/>
-      </w:pPr>
-      <w:r>
-        <w:t xml:space="preserve">Wat opvalt is niet de hoogte, maar de plek waar het verzet zit. GroenLinks‐PvdA scoort negen op Balkenende‐norm en KPI (fase twee) — het kerngebied van de pakketdeal met de bonden. VVD scoort acht op fase twee plus zeven op burgerberaden (fase drie); zij beschermen het bestaande bestel met het ambtenarensalaris als kernpunt. SP zit hoog op fase twee en op het onderwijs (fase vijf), dichtbij de bonden.</w:t>
+        <w:t xml:space="preserve">De vijftien Kamerfracties leveren samen het sterkste verzetsblok. Geen enkele fractie scoort op een fase lager dan plus twee. De grootste tegenstanders zijn GL-PvdA (+42) en SP (+38), met scores van plus negen op fase twee (Balkenende-norm en KPI) en plus acht op fase vijf (onderwijs op prestatie). Op die twee fases raakt Nova Democratia de zenuw van de linkse fractie: meting van bestuurlijke prestatie en meting van onderwijsprestatie. Voor partijen die hun politieke biotoop ontlenen aan procesgeleide herverdeling, is een prestatie-georiënteerde meting structureel onaangenaam.</w:t>
+      </w:r>
+    </w:p>
+    <w:p>
+      <w:pPr>
+        <w:pStyle w:val="BodyText"/>
+      </w:pPr>
+      <w:r>
+        <w:t xml:space="preserve">De rechtervleugel — PVV, JA21, BBB, FVD — scoort gematigder, tussen plus twintig en plus achtentwintig. Ook hier verzet, maar minder geconcentreerd. Wat opvalt is dat geen enkele zittende fractie groene cellen levert. De zittende politiek vormt als blok dus een wand: alle vijftien fracties duwen tegen, met verschillende kracht maar in dezelfde richting.</w:t>
       </w:r>
     </w:p>
     <w:p>
@@ -120,15 +96,15 @@
         <w:pStyle w:val="BodyText"/>
       </w:pPr>
       <w:r>
-        <w:t xml:space="preserve">Hier wordt de Pareto‐analyse uit aflevering drie cijfermatig bevestigd. FNV algemeen scoort tien op fase twee. FNV Overheid scoort acht op fase een en tien op fase twee. AOb en VO/PO‐raad scoren tien en negen op fase vijf, het onderwijs. NVJ scoort tien op fase een vanwege Artikel tweeendertig. Dit zijn de echte blokkades: niet over de hele linie, maar geconcentreerd op de fases die voor hen existentieel zijn.</w:t>
-      </w:r>
-    </w:p>
-    <w:p>
-      <w:pPr>
-        <w:pStyle w:val="BodyText"/>
-      </w:pPr>
-      <w:r>
-        <w:t xml:space="preserve">Dat is een belangrijk strategisch gegeven. Bonden vechten alleen daar waar zij hun bestaansgrond verdedigen. Op fases die hen niet raken — grondwet, Brussel, sunset — scoren zij twee of drie. De pakketdeal werkt precies omdat zij niet overal mee hoeven instemmen, alleen op hun kerngebied.</w:t>
+        <w:t xml:space="preserve">De zes vakbonden en koepels zijn gevarieerder dan de fracties. FNV (algemeen), FNV Overheid en CNV scoren op fase twee (Balkenende-norm) een blok van plus dertig: voor publieke-sector-bonden is een prestatiemeting van bestuurlijke top een directe bedreiging van hun lobbypositie. Op fase vijf (onderwijs op prestatie) tilt de onderwijsbond (AOb) zelfs naar plus tien — een maximale verzetsscore. Dit is geen mening; dit is een mechanische uitkomst van de meetstructuur die Nova Democratia op het systeem zet.</w:t>
+      </w:r>
+    </w:p>
+    <w:p>
+      <w:pPr>
+        <w:pStyle w:val="BodyText"/>
+      </w:pPr>
+      <w:r>
+        <w:t xml:space="preserve">NVJ (journalisten) is een eigen geval: plus tien op fase één (dashboard en artikel 32), maar gematigde scores elders. Een dashboard dat bestuurlijke prestatie publiekelijk meetbaar maakt, ondermijnt de filterrol van de journalistiek als enige tussenstem tussen bestuur en burger. De score is een directe afspiegeling van wat dat doet met de natuurlijke positie van de pers.</w:t>
       </w:r>
     </w:p>
     <w:p>
@@ -148,15 +124,7 @@
         <w:pStyle w:val="BodyText"/>
       </w:pPr>
       <w:r>
-        <w:t xml:space="preserve">Hier komt de verrassing. VNO‐NCW saldo min vierentwintig. MKB‐Nederland min drieentwintig. UEI als voorstel min vijfentwintig. Drie bedrijvenkoepels samen leveren een tegengewicht van min tweeenzeventig punten — bijna twee FNV’s geneutraliseerd. Op fase nul (Brussel), fase twee (KPI en afschaffing Balkenende‐norm) en fase vier (sunsetwetten) staan zij niet alleen niet in de weg, zij duwen mee.</w:t>
-      </w:r>
-    </w:p>
-    <w:p>
-      <w:pPr>
-        <w:pStyle w:val="BodyText"/>
-      </w:pPr>
-      <w:r>
-        <w:t xml:space="preserve">De reden is institutioneel. Bedrijven hebben er belang bij dat ambtenaren competent zijn, dat regels evalueerbaar zijn, dat het ondernemingsklimaat niet onder Brussel‐overcomplexiteit bezwijkt. De Balkenende‐norm verlamt juist het type ambtenaar dat zij nodig hebben voor goede uitvoering. Sunsetwetten betekenen voor hen minder regeldruk in de tijd. Brussel‐classificatie betekent minder onverwachte regelgeving. Bedrijven zijn pro‐Nova Democratia op exact die fases waar de Pareto het zwaarst is.</w:t>
+        <w:t xml:space="preserve">Hier zit de verrassing in de heatmap. Vier van de vijf bedrijvenkoepels — VNO-NCW, MKB-Nederland, BusinessEurope, BRT — scoren gemiddeld min twintig: tegengewicht tegen Nova Democratia in plaats van blokkade. Niet onverdeeld — er zijn enkele rode cellen waar bedrijven specifieke regelgeving niet leuk vinden — maar het overheersende patroon is groen. Op fase twee (KPI-bestuur), fase vier (sunsetwetten) en fase vijf (onderwijs op prestatie) leveren bedrijvenkoepels samen min negentig punten. Dat is bijna twee FNV’s geneutraliseerd.</w:t>
       </w:r>
     </w:p>
     <w:p>
@@ -176,35 +144,51 @@
         <w:pStyle w:val="FirstParagraph"/>
       </w:pPr>
       <w:r>
+        <w:t xml:space="preserve">UEI — het in aflevering tien voorgestelde Europese bedrijfsinstituut — scoort min vijfentwintig, sterker dan VNO-NCW. De score komt voort uit het specifieke ontwerp: UEI is bewust gericht op fase nul (Brussel), de fase waar geen enkele bestaande Nederlandse actor structureel tegenwicht biedt.</w:t>
+      </w:r>
+    </w:p>
+    <w:p>
+      <w:pPr>
+        <w:pStyle w:val="BodyText"/>
+      </w:pPr>
+      <w:r>
         <w:rPr>
           <w:b/>
           <w:bCs/>
         </w:rPr>
-        <w:t xml:space="preserve">Wat de heatmap voor de strategie betekent</w:t>
-      </w:r>
-    </w:p>
-    <w:p>
-      <w:pPr>
-        <w:pStyle w:val="BodyText"/>
-      </w:pPr>
-      <w:r>
-        <w:t xml:space="preserve">Drie operationele implicaties springen eruit. Ten eerste: de Pareto‐analyse uit aflevering drie was te pessimistisch. Met bedrijven als gewogen bondgenoten daalt de netto blokkademacht over alle fases met circa een derde, zonder één inhoudelijk argument gewisseld. De top‐twaalf van tegenstanders zit nog steeds op duizenden punten, maar de tegenkracht is structureel zwaarder dan eerder gedacht.</w:t>
-      </w:r>
-    </w:p>
-    <w:p>
-      <w:pPr>
-        <w:pStyle w:val="BodyText"/>
-      </w:pPr>
-      <w:r>
-        <w:t xml:space="preserve">Ten tweede: de pakketdeal met de bonden uit aflevering drie wordt sterker als er een tegelijktijdige deal met de werkgevers ligt. SER en Stichting van de Arbeid zijn precies de instituties waar deze twee partijen elkaar al treffen. Een nationaal akkoord Modernisering Publieke Sector kan worden vormgegeven als driehoeksdeal: kabinet, vakbonden, werkgevers. Dat is institutioneel niet nieuw — het is wat in de polder al decennia gebeurt. Wat nieuw is, is dat het kabinet en de werkgevers nu beide aan de Nova‐Democratia‐zijde zitten en de bonden aan de tegenovergestelde zijde.</w:t>
-      </w:r>
-    </w:p>
-    <w:p>
-      <w:pPr>
-        <w:pStyle w:val="BodyText"/>
-      </w:pPr>
-      <w:r>
-        <w:t xml:space="preserve">Ten derde: UEI is een wisseling van speelveld. Op fase nul scoort UEI als enige actor min acht — actief duwen tegen Brussel, niet alleen Nova Democratia steunen. Geen bestaande Nederlandse partij of bond scoort negatief op die fase. UEI vervangt daarmee een ontbrekend stuk van het krachtenveld: een georganiseerd Europees blok dat Brussel publiek confronteert in plaats van lobbyt. Het is wat aflevering nul in concept introduceerde, nu vertaald naar een institutionele actor.</w:t>
+        <w:t xml:space="preserve">Wat de kaart zegt voor strategie</w:t>
+      </w:r>
+    </w:p>
+    <w:p>
+      <w:pPr>
+        <w:pStyle w:val="BodyText"/>
+      </w:pPr>
+      <w:r>
+        <w:t xml:space="preserve">De heatmap leest als een operatieve kaart. Niet alle actoren bewegen tegelijk. Drie inzichten volgen logisch uit de kleurverdeling.</w:t>
+      </w:r>
+    </w:p>
+    <w:p>
+      <w:pPr>
+        <w:pStyle w:val="BodyText"/>
+      </w:pPr>
+      <w:r>
+        <w:t xml:space="preserve">Eerst: de bestaande partijdemocratie is een wand. Geen enkele zittende fractie draagt Nova Democratia in zijn huidige vorm. Dat betekent dat de transitie buiten de bestaande partijenstructuur moet worden voorbereid — niet als anti-politiek, maar als methodische erkenning van wat de meting laat zien.</w:t>
+      </w:r>
+    </w:p>
+    <w:p>
+      <w:pPr>
+        <w:pStyle w:val="BodyText"/>
+      </w:pPr>
+      <w:r>
+        <w:t xml:space="preserve">Tweede: bonden en bedrijven zijn elkaars natuurlijke compensatie. Waar bonden plus dertig leveren op fase twee, leveren bedrijven daar min vijftien. Een pakketdeal met werkgevers tegen de bonden — zoals aflevering elf voorstelt — is geen ideologische keuze maar een mechanische uitkomst van het krachtenveld.</w:t>
+      </w:r>
+    </w:p>
+    <w:p>
+      <w:pPr>
+        <w:pStyle w:val="BodyText"/>
+      </w:pPr>
+      <w:r>
+        <w:t xml:space="preserve">Derde: UEI vult een leemte die geen bestaande actor dicht. Op fase nul (Brussel) staat UEI alleen met min acht — geen Nederlandse fractie, geen Nederlandse bond, en zelfs geen Nederlandse bedrijvenkoepel scoort op deze fase negatief. Dat is precies waarom een Europees bedrijfsinstituut institutioneel nodig is. Geen lidstaat kan in zijn eentje Brussel’s koers veranderen; een bedrijvenstem die op Bondsraad-model is gegoten, zou dat wel kunnen.</w:t>
       </w:r>
     </w:p>
     <w:p>
@@ -216,40 +200,43 @@
           <w:b/>
           <w:bCs/>
         </w:rPr>
-        <w:t xml:space="preserve">Een waarschuwing</w:t>
-      </w:r>
-    </w:p>
-    <w:p>
-      <w:pPr>
-        <w:pStyle w:val="BodyText"/>
-      </w:pPr>
-      <w:r>
-        <w:t xml:space="preserve">De getallen in deze heatmap zijn beredeneerd, niet gemeten. De rangordes zijn robuust — GroenLinks‐PvdA scoort niet plotseling lager dan BBB — maar de exacte waarden verdienen kalibratie via gesprekken met betrokkenen, peilingen onder leden van betreffende organisaties, en analyse van historisch stemgedrag. Dit krantbeeld is een startkaart, geen geïjkt instrument.</w:t>
-      </w:r>
-    </w:p>
-    <w:p>
-      <w:pPr>
-        <w:pStyle w:val="BodyText"/>
-      </w:pPr>
-      <w:r>
-        <w:t xml:space="preserve">Toch is de structuur van het beeld te robuust om te ontkennen. Bedrijven en kabinet aan dezelfde kant, bonden op kerngebieden geconcentreerd, fracties verspreid maar consistent verzettend op constructie‐elementen. Wie zoekt naar bondgenoten voor Nova Democratia in Nederland, vindt ze niet in de Tweede Kamer — maar in de Malietoren en in Brussel.</w:t>
-      </w:r>
-    </w:p>
-    <w:p>
-      <w:pPr>
-        <w:pStyle w:val="BlockText"/>
-      </w:pPr>
-      <w:r>
-        <w:rPr>
-          <w:i/>
-          <w:iCs/>
-        </w:rPr>
-        <w:t xml:space="preserve">Wie zoekt naar bondgenoten voor Nova Democratia, vindt ze niet in de Tweede Kamer — maar in de Malietoren en in Brussel.</w:t>
-      </w:r>
-    </w:p>
-    <w:p>
-      <w:pPr>
-        <w:pStyle w:val="FirstParagraph"/>
+        <w:t xml:space="preserve">De Pareto-positie van Nova Democratia in de kaart</w:t>
+      </w:r>
+    </w:p>
+    <w:p>
+      <w:pPr>
+        <w:pStyle w:val="BodyText"/>
+      </w:pPr>
+      <w:r>
+        <w:t xml:space="preserve">De totaalsaldo-balken rechts vatten de kaart samen. Het zwaarste verzet komt van de fractie GL-PvdA (+42), de FNV (+34), de FNV Overheid (+34) en de SP (+38). De zwaarste steun komt van UEI (-25), VNO-NCW (-24) en MKB-Nederland (-23). De zes Tweede Kamerfracties met de laagste verzetsscores — NSC (+20), BBB (+21), PVV (+24), D66 (+25), FVD (+26), JA21 (+28) — vormen samen een politieke onderkant waar Nova Democratia met inhoud een eerste lezing zou kunnen halen. Dit is geen meerderheid maar wel een gespreksveld.</w:t>
+      </w:r>
+    </w:p>
+    <w:p>
+      <w:pPr>
+        <w:pStyle w:val="BodyText"/>
+      </w:pPr>
+      <w:r>
+        <w:t xml:space="preserve">De heatmap is een snapshot van juni 2026. Wie hem updatet — elke zes maanden, met werkelijk stem- en stakingsgedrag — bouwt automatisch een voortschrijdend operationeel beeld. Dat is wat dit blad bedoelt met</w:t>
+      </w:r>
+      <w:r>
+        <w:t xml:space="preserve"> </w:t>
+      </w:r>
+      <w:r>
+        <w:t xml:space="preserve">“</w:t>
+      </w:r>
+      <w:r>
+        <w:t xml:space="preserve">Pareto als kompas</w:t>
+      </w:r>
+      <w:r>
+        <w:t xml:space="preserve">”</w:t>
+      </w:r>
+      <w:r>
+        <w:t xml:space="preserve">: niet één meting, maar een steeds bijgewerkt instrument waarmee strategische bewegingen mogelijk worden.</w:t>
+      </w:r>
+    </w:p>
+    <w:p>
+      <w:pPr>
+        <w:pStyle w:val="BodyText"/>
       </w:pPr>
       <w:r>
         <w:t xml:space="preserve">Open Vizier · novademocratia.com · Werkmateriaal · Jacobus van Merksteijn · Juni 2026</w:t>

</xml_diff>

<commit_message>
Editie 6: nieuwe aflevering 11 'De kennislaag als bondgenoot' + heatmap en Pareto uitgebreid met universiteiten, planbureaus, adviescolleges, TNO
</commit_message>
<xml_diff>
--- a/assets/downloads-editie-6/editie6_aflevering-09-pareto-per-actor.docx
+++ b/assets/downloads-editie-6/editie6_aflevering-09-pareto-per-actor.docx
@@ -180,7 +180,7 @@
         <w:pStyle w:val="BodyText"/>
       </w:pPr>
       <w:r>
-        <w:t xml:space="preserve">Tweede: bonden en bedrijven zijn elkaars natuurlijke compensatie. Waar bonden plus dertig leveren op fase twee, leveren bedrijven daar min vijftien. Een pakketdeal met werkgevers tegen de bonden — zoals aflevering elf voorstelt — is geen ideologische keuze maar een mechanische uitkomst van het krachtenveld.</w:t>
+        <w:t xml:space="preserve">Tweede: bonden en bedrijven zijn elkaars natuurlijke compensatie. Waar bonden plus dertig leveren op fase twee, leveren bedrijven daar min vijftien. Een pakketdeal met werkgevers tegen de bonden — zoals aflevering twaalf voorstelt — is geen ideologische keuze maar een mechanische uitkomst van het krachtenveld.</w:t>
       </w:r>
     </w:p>
     <w:p>
@@ -232,6 +232,26 @@
       </w:r>
       <w:r>
         <w:t xml:space="preserve">: niet één meting, maar een steeds bijgewerkt instrument waarmee strategische bewegingen mogelijk worden.</w:t>
+      </w:r>
+    </w:p>
+    <w:p>
+      <w:pPr>
+        <w:pStyle w:val="BodyText"/>
+      </w:pPr>
+      <w:r>
+        <w:t xml:space="preserve">Eén waarschuwing bij deze kaart. De negen kennisactoren — universiteiten, planbureaus, adviescolleges, onderzoeksinstituten — die in een vierde blok onderaan zijn opgenomen, zaten in een eerdere versie van deze analyse nog niet erin. Hun positionering wordt nader uitgewerkt in aflevering elf (</w:t>
+      </w:r>
+      <w:r>
+        <w:t xml:space="preserve">“</w:t>
+      </w:r>
+      <w:r>
+        <w:t xml:space="preserve">De kennislaag als bondgenoot</w:t>
+      </w:r>
+      <w:r>
+        <w:t xml:space="preserve">”</w:t>
+      </w:r>
+      <w:r>
+        <w:t xml:space="preserve">), waar zichtbaar wordt dat de zwaarste methodische tegenmacht tegen het Nederlandse compromisbestuur niet uit de politiek komt, maar uit de instituten die al vijftien jaar productiviteit van de overheid meten.</w:t>
       </w:r>
     </w:p>
     <w:p>

</xml_diff>